<commit_message>
pagina pacientes e botoes de login/logoff
</commit_message>
<xml_diff>
--- a/documentacao/Dados cadastro de Clientes da NeuroCare 2025.docx
+++ b/documentacao/Dados cadastro de Clientes da NeuroCare 2025.docx
@@ -1334,6 +1334,23 @@
     </w:p>
     <w:p>
       <w:pPr>
+        <w:rPr>
+          <w:rFonts w:ascii="Century Gothic" w:hAnsi="Century Gothic"/>
+          <w:sz w:val="24"/>
+          <w:szCs w:val="24"/>
+        </w:rPr>
+      </w:pPr>
+      <w:r>
+        <w:rPr>
+          <w:rFonts w:ascii="Century Gothic" w:hAnsi="Century Gothic"/>
+          <w:sz w:val="24"/>
+          <w:szCs w:val="24"/>
+        </w:rPr>
+        <w:t>Adolescente (13-18 anos)</w:t>
+      </w:r>
+    </w:p>
+    <w:p>
+      <w:pPr>
         <w:numPr>
           <w:ilvl w:val="2"/>
           <w:numId w:val="3"/>
@@ -1352,7 +1369,7 @@
           <w:sz w:val="24"/>
           <w:szCs w:val="24"/>
         </w:rPr>
-        <w:t>Adolescente (13-18 anos)</w:t>
+        <w:t>Adulto (19-59 anos)</w:t>
       </w:r>
     </w:p>
     <w:p>
@@ -1375,7 +1392,124 @@
           <w:sz w:val="24"/>
           <w:szCs w:val="24"/>
         </w:rPr>
-        <w:t>Adulto (19-59 anos)</w:t>
+        <w:t>Idoso (60+ anos)</w:t>
+      </w:r>
+    </w:p>
+    <w:p>
+      <w:pPr>
+        <w:numPr>
+          <w:ilvl w:val="0"/>
+          <w:numId w:val="3"/>
+        </w:numPr>
+        <w:spacing w:after="200"/>
+        <w:jc w:val="both"/>
+        <w:rPr>
+          <w:rFonts w:ascii="Century Gothic" w:hAnsi="Century Gothic"/>
+          <w:sz w:val="24"/>
+          <w:szCs w:val="24"/>
+        </w:rPr>
+      </w:pPr>
+      <w:r>
+        <w:rPr>
+          <w:rFonts w:ascii="Century Gothic" w:hAnsi="Century Gothic"/>
+          <w:b/>
+          <w:bCs/>
+          <w:sz w:val="24"/>
+          <w:szCs w:val="24"/>
+        </w:rPr>
+        <w:t>Status do Paciente:</w:t>
+      </w:r>
+      <w:r>
+        <w:rPr>
+          <w:rFonts w:ascii="Century Gothic" w:hAnsi="Century Gothic"/>
+          <w:sz w:val="24"/>
+          <w:szCs w:val="24"/>
+        </w:rPr>
+        <w:t xml:space="preserve"> </w:t>
+      </w:r>
+    </w:p>
+    <w:p>
+      <w:pPr>
+        <w:numPr>
+          <w:ilvl w:val="1"/>
+          <w:numId w:val="3"/>
+        </w:numPr>
+        <w:spacing w:after="200"/>
+        <w:jc w:val="both"/>
+        <w:rPr>
+          <w:rFonts w:ascii="Century Gothic" w:hAnsi="Century Gothic"/>
+          <w:sz w:val="24"/>
+          <w:szCs w:val="24"/>
+        </w:rPr>
+      </w:pPr>
+      <w:r>
+        <w:rPr>
+          <w:rFonts w:ascii="Century Gothic" w:hAnsi="Century Gothic"/>
+          <w:b/>
+          <w:bCs/>
+          <w:sz w:val="24"/>
+          <w:szCs w:val="24"/>
+        </w:rPr>
+        <w:t>Tipo de Campo:</w:t>
+      </w:r>
+      <w:r>
+        <w:rPr>
+          <w:rFonts w:ascii="Century Gothic" w:hAnsi="Century Gothic"/>
+          <w:sz w:val="24"/>
+          <w:szCs w:val="24"/>
+        </w:rPr>
+        <w:t xml:space="preserve"> Janela de opções (</w:t>
+      </w:r>
+      <w:proofErr w:type="spellStart"/>
+      <w:r>
+        <w:rPr>
+          <w:rFonts w:ascii="Century Gothic" w:hAnsi="Century Gothic"/>
+          <w:sz w:val="24"/>
+          <w:szCs w:val="24"/>
+        </w:rPr>
+        <w:t>Dropdown</w:t>
+      </w:r>
+      <w:proofErr w:type="spellEnd"/>
+      <w:r>
+        <w:rPr>
+          <w:rFonts w:ascii="Century Gothic" w:hAnsi="Century Gothic"/>
+          <w:sz w:val="24"/>
+          <w:szCs w:val="24"/>
+        </w:rPr>
+        <w:t>/Caixa de seleção).</w:t>
+      </w:r>
+    </w:p>
+    <w:p>
+      <w:pPr>
+        <w:numPr>
+          <w:ilvl w:val="1"/>
+          <w:numId w:val="3"/>
+        </w:numPr>
+        <w:spacing w:after="200"/>
+        <w:jc w:val="both"/>
+        <w:rPr>
+          <w:rFonts w:ascii="Century Gothic" w:hAnsi="Century Gothic"/>
+          <w:sz w:val="24"/>
+          <w:szCs w:val="24"/>
+        </w:rPr>
+      </w:pPr>
+      <w:r>
+        <w:rPr>
+          <w:rFonts w:ascii="Century Gothic" w:hAnsi="Century Gothic"/>
+          <w:b/>
+          <w:bCs/>
+          <w:sz w:val="24"/>
+          <w:szCs w:val="24"/>
+        </w:rPr>
+        <w:t>Opções:</w:t>
+      </w:r>
+      <w:r>
+        <w:rPr>
+          <w:rFonts w:ascii="Century Gothic" w:hAnsi="Century Gothic"/>
+          <w:sz w:val="24"/>
+          <w:szCs w:val="24"/>
+        </w:rPr>
+        <w:t xml:space="preserve"> </w:t>
       </w:r>
     </w:p>
     <w:p>
@@ -1398,124 +1532,7 @@
           <w:sz w:val="24"/>
           <w:szCs w:val="24"/>
         </w:rPr>
-        <w:t>Idoso (60+ anos)</w:t>
-      </w:r>
-    </w:p>
-    <w:p>
-      <w:pPr>
-        <w:numPr>
-          <w:ilvl w:val="0"/>
-          <w:numId w:val="3"/>
-        </w:numPr>
-        <w:spacing w:after="200"/>
-        <w:jc w:val="both"/>
-        <w:rPr>
-          <w:rFonts w:ascii="Century Gothic" w:hAnsi="Century Gothic"/>
-          <w:sz w:val="24"/>
-          <w:szCs w:val="24"/>
-        </w:rPr>
-      </w:pPr>
-      <w:r>
-        <w:rPr>
-          <w:rFonts w:ascii="Century Gothic" w:hAnsi="Century Gothic"/>
-          <w:b/>
-          <w:bCs/>
-          <w:sz w:val="24"/>
-          <w:szCs w:val="24"/>
-        </w:rPr>
-        <w:t>Status do Paciente:</w:t>
-      </w:r>
-      <w:r>
-        <w:rPr>
-          <w:rFonts w:ascii="Century Gothic" w:hAnsi="Century Gothic"/>
-          <w:sz w:val="24"/>
-          <w:szCs w:val="24"/>
-        </w:rPr>
-        <w:t xml:space="preserve"> </w:t>
-      </w:r>
-    </w:p>
-    <w:p>
-      <w:pPr>
-        <w:numPr>
-          <w:ilvl w:val="1"/>
-          <w:numId w:val="3"/>
-        </w:numPr>
-        <w:spacing w:after="200"/>
-        <w:jc w:val="both"/>
-        <w:rPr>
-          <w:rFonts w:ascii="Century Gothic" w:hAnsi="Century Gothic"/>
-          <w:sz w:val="24"/>
-          <w:szCs w:val="24"/>
-        </w:rPr>
-      </w:pPr>
-      <w:r>
-        <w:rPr>
-          <w:rFonts w:ascii="Century Gothic" w:hAnsi="Century Gothic"/>
-          <w:b/>
-          <w:bCs/>
-          <w:sz w:val="24"/>
-          <w:szCs w:val="24"/>
-        </w:rPr>
-        <w:t>Tipo de Campo:</w:t>
-      </w:r>
-      <w:r>
-        <w:rPr>
-          <w:rFonts w:ascii="Century Gothic" w:hAnsi="Century Gothic"/>
-          <w:sz w:val="24"/>
-          <w:szCs w:val="24"/>
-        </w:rPr>
-        <w:t xml:space="preserve"> Janela de opções (</w:t>
-      </w:r>
-      <w:proofErr w:type="spellStart"/>
-      <w:r>
-        <w:rPr>
-          <w:rFonts w:ascii="Century Gothic" w:hAnsi="Century Gothic"/>
-          <w:sz w:val="24"/>
-          <w:szCs w:val="24"/>
-        </w:rPr>
-        <w:t>Dropdown</w:t>
-      </w:r>
-      <w:proofErr w:type="spellEnd"/>
-      <w:r>
-        <w:rPr>
-          <w:rFonts w:ascii="Century Gothic" w:hAnsi="Century Gothic"/>
-          <w:sz w:val="24"/>
-          <w:szCs w:val="24"/>
-        </w:rPr>
-        <w:t>/Caixa de seleção).</w:t>
-      </w:r>
-    </w:p>
-    <w:p>
-      <w:pPr>
-        <w:numPr>
-          <w:ilvl w:val="1"/>
-          <w:numId w:val="3"/>
-        </w:numPr>
-        <w:spacing w:after="200"/>
-        <w:jc w:val="both"/>
-        <w:rPr>
-          <w:rFonts w:ascii="Century Gothic" w:hAnsi="Century Gothic"/>
-          <w:sz w:val="24"/>
-          <w:szCs w:val="24"/>
-        </w:rPr>
-      </w:pPr>
-      <w:r>
-        <w:rPr>
-          <w:rFonts w:ascii="Century Gothic" w:hAnsi="Century Gothic"/>
-          <w:b/>
-          <w:bCs/>
-          <w:sz w:val="24"/>
-          <w:szCs w:val="24"/>
-        </w:rPr>
-        <w:t>Opções:</w:t>
-      </w:r>
-      <w:r>
-        <w:rPr>
-          <w:rFonts w:ascii="Century Gothic" w:hAnsi="Century Gothic"/>
-          <w:sz w:val="24"/>
-          <w:szCs w:val="24"/>
-        </w:rPr>
-        <w:t xml:space="preserve"> </w:t>
+        <w:t>Ativo</w:t>
       </w:r>
     </w:p>
     <w:p>
@@ -1538,7 +1555,7 @@
           <w:sz w:val="24"/>
           <w:szCs w:val="24"/>
         </w:rPr>
-        <w:t>Ativo</w:t>
+        <w:t>Inativo</w:t>
       </w:r>
     </w:p>
     <w:p>
@@ -1561,7 +1578,7 @@
           <w:sz w:val="24"/>
           <w:szCs w:val="24"/>
         </w:rPr>
-        <w:t>Inativo</w:t>
+        <w:t>Alta</w:t>
       </w:r>
     </w:p>
     <w:p>
@@ -1584,29 +1601,6 @@
           <w:sz w:val="24"/>
           <w:szCs w:val="24"/>
         </w:rPr>
-        <w:t>Alta</w:t>
-      </w:r>
-    </w:p>
-    <w:p>
-      <w:pPr>
-        <w:numPr>
-          <w:ilvl w:val="2"/>
-          <w:numId w:val="3"/>
-        </w:numPr>
-        <w:spacing w:after="200"/>
-        <w:jc w:val="both"/>
-        <w:rPr>
-          <w:rFonts w:ascii="Century Gothic" w:hAnsi="Century Gothic"/>
-          <w:sz w:val="24"/>
-          <w:szCs w:val="24"/>
-        </w:rPr>
-      </w:pPr>
-      <w:r>
-        <w:rPr>
-          <w:rFonts w:ascii="Century Gothic" w:hAnsi="Century Gothic"/>
-          <w:sz w:val="24"/>
-          <w:szCs w:val="24"/>
-        </w:rPr>
         <w:t>Em Espera</w:t>
       </w:r>
     </w:p>
@@ -1630,7 +1624,6 @@
           <w:sz w:val="24"/>
           <w:szCs w:val="24"/>
         </w:rPr>
-        <w:lastRenderedPageBreak/>
         <w:t>1.3 Espaço para Informações Adicionais</w:t>
       </w:r>
     </w:p>
@@ -1656,6 +1649,7 @@
           <w:sz w:val="24"/>
           <w:szCs w:val="24"/>
         </w:rPr>
+        <w:lastRenderedPageBreak/>
         <w:t>Campo "Observações Gerais":</w:t>
       </w:r>
       <w:r>
@@ -2444,7 +2438,6 @@
           <w:sz w:val="24"/>
           <w:szCs w:val="24"/>
         </w:rPr>
-        <w:lastRenderedPageBreak/>
         <w:t>2.2 Vinculação e Filtragem</w:t>
       </w:r>
     </w:p>
@@ -2470,6 +2463,7 @@
           <w:sz w:val="24"/>
           <w:szCs w:val="24"/>
         </w:rPr>
+        <w:lastRenderedPageBreak/>
         <w:t>Vinculação:</w:t>
       </w:r>
       <w:r>
@@ -3147,38 +3141,38 @@
           <w:sz w:val="24"/>
           <w:szCs w:val="24"/>
         </w:rPr>
+        <w:t>Anexar Laudo:</w:t>
+      </w:r>
+      <w:r>
+        <w:rPr>
+          <w:rFonts w:ascii="Century Gothic" w:hAnsi="Century Gothic"/>
+          <w:sz w:val="24"/>
+          <w:szCs w:val="24"/>
+        </w:rPr>
+        <w:t xml:space="preserve"> Opção para anexar o laudo final em PDF.</w:t>
+      </w:r>
+    </w:p>
+    <w:p>
+      <w:pPr>
+        <w:spacing w:after="200"/>
+        <w:jc w:val="both"/>
+        <w:rPr>
+          <w:rFonts w:ascii="Century Gothic" w:hAnsi="Century Gothic"/>
+          <w:b/>
+          <w:bCs/>
+          <w:sz w:val="24"/>
+          <w:szCs w:val="24"/>
+        </w:rPr>
+      </w:pPr>
+      <w:r>
+        <w:rPr>
+          <w:rFonts w:ascii="Century Gothic" w:hAnsi="Century Gothic"/>
+          <w:b/>
+          <w:bCs/>
+          <w:sz w:val="24"/>
+          <w:szCs w:val="24"/>
+        </w:rPr>
         <w:lastRenderedPageBreak/>
-        <w:t>Anexar Laudo:</w:t>
-      </w:r>
-      <w:r>
-        <w:rPr>
-          <w:rFonts w:ascii="Century Gothic" w:hAnsi="Century Gothic"/>
-          <w:sz w:val="24"/>
-          <w:szCs w:val="24"/>
-        </w:rPr>
-        <w:t xml:space="preserve"> Opção para anexar o laudo final em PDF.</w:t>
-      </w:r>
-    </w:p>
-    <w:p>
-      <w:pPr>
-        <w:spacing w:after="200"/>
-        <w:jc w:val="both"/>
-        <w:rPr>
-          <w:rFonts w:ascii="Century Gothic" w:hAnsi="Century Gothic"/>
-          <w:b/>
-          <w:bCs/>
-          <w:sz w:val="24"/>
-          <w:szCs w:val="24"/>
-        </w:rPr>
-      </w:pPr>
-      <w:r>
-        <w:rPr>
-          <w:rFonts w:ascii="Century Gothic" w:hAnsi="Century Gothic"/>
-          <w:b/>
-          <w:bCs/>
-          <w:sz w:val="24"/>
-          <w:szCs w:val="24"/>
-        </w:rPr>
         <w:t>3.3 Reabilitação Neuropsicológica</w:t>
       </w:r>
     </w:p>
@@ -4078,7 +4072,6 @@
           <w:sz w:val="24"/>
           <w:szCs w:val="24"/>
         </w:rPr>
-        <w:lastRenderedPageBreak/>
         <w:t>Opções:</w:t>
       </w:r>
       <w:r>
@@ -4110,6 +4103,7 @@
           <w:sz w:val="24"/>
           <w:szCs w:val="24"/>
         </w:rPr>
+        <w:lastRenderedPageBreak/>
         <w:t>Objetivo Alcançado</w:t>
       </w:r>
     </w:p>
@@ -4911,56 +4905,56 @@
           <w:sz w:val="24"/>
           <w:szCs w:val="24"/>
         </w:rPr>
+        <w:t>Vinculação Financeira:</w:t>
+      </w:r>
+      <w:r>
+        <w:rPr>
+          <w:rFonts w:ascii="Century Gothic" w:hAnsi="Century Gothic"/>
+          <w:sz w:val="24"/>
+          <w:szCs w:val="24"/>
+        </w:rPr>
+        <w:t xml:space="preserve"> Cada registro de venda aqui automaticamente geraria uma entrada correspondente no </w:t>
+      </w:r>
+      <w:r>
+        <w:rPr>
+          <w:rFonts w:ascii="Century Gothic" w:hAnsi="Century Gothic"/>
+          <w:b/>
+          <w:bCs/>
+          <w:sz w:val="24"/>
+          <w:szCs w:val="24"/>
+        </w:rPr>
+        <w:t>Registro Financeiro</w:t>
+      </w:r>
+      <w:r>
+        <w:rPr>
+          <w:rFonts w:ascii="Century Gothic" w:hAnsi="Century Gothic"/>
+          <w:sz w:val="24"/>
+          <w:szCs w:val="24"/>
+        </w:rPr>
+        <w:t>, vinculada ao paciente e categorizada como "Venda de Produto (Vinculada ao Paciente)".</w:t>
+      </w:r>
+    </w:p>
+    <w:p>
+      <w:pPr>
+        <w:spacing w:after="200"/>
+        <w:jc w:val="both"/>
+        <w:rPr>
+          <w:rFonts w:ascii="Century Gothic" w:hAnsi="Century Gothic"/>
+          <w:b/>
+          <w:bCs/>
+          <w:sz w:val="24"/>
+          <w:szCs w:val="24"/>
+        </w:rPr>
+      </w:pPr>
+      <w:r>
+        <w:rPr>
+          <w:rFonts w:ascii="Century Gothic" w:hAnsi="Century Gothic"/>
+          <w:b/>
+          <w:bCs/>
+          <w:sz w:val="24"/>
+          <w:szCs w:val="24"/>
+        </w:rPr>
         <w:lastRenderedPageBreak/>
-        <w:t>Vinculação Financeira:</w:t>
-      </w:r>
-      <w:r>
-        <w:rPr>
-          <w:rFonts w:ascii="Century Gothic" w:hAnsi="Century Gothic"/>
-          <w:sz w:val="24"/>
-          <w:szCs w:val="24"/>
-        </w:rPr>
-        <w:t xml:space="preserve"> Cada registro de venda aqui automaticamente geraria uma entrada correspondente no </w:t>
-      </w:r>
-      <w:r>
-        <w:rPr>
-          <w:rFonts w:ascii="Century Gothic" w:hAnsi="Century Gothic"/>
-          <w:b/>
-          <w:bCs/>
-          <w:sz w:val="24"/>
-          <w:szCs w:val="24"/>
-        </w:rPr>
-        <w:t>Registro Financeiro</w:t>
-      </w:r>
-      <w:r>
-        <w:rPr>
-          <w:rFonts w:ascii="Century Gothic" w:hAnsi="Century Gothic"/>
-          <w:sz w:val="24"/>
-          <w:szCs w:val="24"/>
-        </w:rPr>
-        <w:t>, vinculada ao paciente e categorizada como "Venda de Produto (Vinculada ao Paciente)".</w:t>
-      </w:r>
-    </w:p>
-    <w:p>
-      <w:pPr>
-        <w:spacing w:after="200"/>
-        <w:jc w:val="both"/>
-        <w:rPr>
-          <w:rFonts w:ascii="Century Gothic" w:hAnsi="Century Gothic"/>
-          <w:b/>
-          <w:bCs/>
-          <w:sz w:val="24"/>
-          <w:szCs w:val="24"/>
-        </w:rPr>
-      </w:pPr>
-      <w:r>
-        <w:rPr>
-          <w:rFonts w:ascii="Century Gothic" w:hAnsi="Century Gothic"/>
-          <w:b/>
-          <w:bCs/>
-          <w:sz w:val="24"/>
-          <w:szCs w:val="24"/>
-        </w:rPr>
         <w:t>4.2 Vendas de Material do Consultório (Geral)</w:t>
       </w:r>
     </w:p>
@@ -5836,7 +5830,6 @@
           <w:sz w:val="24"/>
           <w:szCs w:val="24"/>
         </w:rPr>
-        <w:lastRenderedPageBreak/>
         <w:t xml:space="preserve">NÃO tem acesso às abas de </w:t>
       </w:r>
       <w:r>
@@ -5878,6 +5871,7 @@
           <w:sz w:val="24"/>
           <w:szCs w:val="24"/>
         </w:rPr>
+        <w:lastRenderedPageBreak/>
         <w:t>NÃO pode inserir ou modificar valores nem finalizar o registro de pagamento nas áreas de Vendas.</w:t>
       </w:r>
     </w:p>
@@ -6481,7 +6475,6 @@
           <w:sz w:val="24"/>
           <w:szCs w:val="24"/>
         </w:rPr>
-        <w:lastRenderedPageBreak/>
         <w:t>Gestão de Usuários (adicionar/remover psicólogas, secretárias, outros administradores, gerenciar senhas e permissões).</w:t>
       </w:r>
     </w:p>
@@ -6505,6 +6498,7 @@
           <w:sz w:val="24"/>
           <w:szCs w:val="24"/>
         </w:rPr>
+        <w:lastRenderedPageBreak/>
         <w:t>Relatórios Gerenciais abrangentes (financeiros, de pacientes, de utilização de serviços e vendas de produtos).</w:t>
       </w:r>
     </w:p>

</xml_diff>

<commit_message>
feat: Adiciona atualizações no documento de cadastro de clientes
</commit_message>
<xml_diff>
--- a/documentacao/Dados cadastro de Clientes da NeuroCare 2025.docx
+++ b/documentacao/Dados cadastro de Clientes da NeuroCare 2025.docx
@@ -1334,6 +1334,23 @@
     </w:p>
     <w:p>
       <w:pPr>
+        <w:rPr>
+          <w:rFonts w:ascii="Century Gothic" w:hAnsi="Century Gothic"/>
+          <w:sz w:val="24"/>
+          <w:szCs w:val="24"/>
+        </w:rPr>
+      </w:pPr>
+      <w:r>
+        <w:rPr>
+          <w:rFonts w:ascii="Century Gothic" w:hAnsi="Century Gothic"/>
+          <w:sz w:val="24"/>
+          <w:szCs w:val="24"/>
+        </w:rPr>
+        <w:t>Adolescente (13-18 anos)</w:t>
+      </w:r>
+    </w:p>
+    <w:p>
+      <w:pPr>
         <w:numPr>
           <w:ilvl w:val="2"/>
           <w:numId w:val="3"/>
@@ -1352,7 +1369,7 @@
           <w:sz w:val="24"/>
           <w:szCs w:val="24"/>
         </w:rPr>
-        <w:t>Adolescente (13-18 anos)</w:t>
+        <w:t>Adulto (19-59 anos)</w:t>
       </w:r>
     </w:p>
     <w:p>
@@ -1375,7 +1392,124 @@
           <w:sz w:val="24"/>
           <w:szCs w:val="24"/>
         </w:rPr>
-        <w:t>Adulto (19-59 anos)</w:t>
+        <w:t>Idoso (60+ anos)</w:t>
+      </w:r>
+    </w:p>
+    <w:p>
+      <w:pPr>
+        <w:numPr>
+          <w:ilvl w:val="0"/>
+          <w:numId w:val="3"/>
+        </w:numPr>
+        <w:spacing w:after="200"/>
+        <w:jc w:val="both"/>
+        <w:rPr>
+          <w:rFonts w:ascii="Century Gothic" w:hAnsi="Century Gothic"/>
+          <w:sz w:val="24"/>
+          <w:szCs w:val="24"/>
+        </w:rPr>
+      </w:pPr>
+      <w:r>
+        <w:rPr>
+          <w:rFonts w:ascii="Century Gothic" w:hAnsi="Century Gothic"/>
+          <w:b/>
+          <w:bCs/>
+          <w:sz w:val="24"/>
+          <w:szCs w:val="24"/>
+        </w:rPr>
+        <w:t>Status do Paciente:</w:t>
+      </w:r>
+      <w:r>
+        <w:rPr>
+          <w:rFonts w:ascii="Century Gothic" w:hAnsi="Century Gothic"/>
+          <w:sz w:val="24"/>
+          <w:szCs w:val="24"/>
+        </w:rPr>
+        <w:t xml:space="preserve"> </w:t>
+      </w:r>
+    </w:p>
+    <w:p>
+      <w:pPr>
+        <w:numPr>
+          <w:ilvl w:val="1"/>
+          <w:numId w:val="3"/>
+        </w:numPr>
+        <w:spacing w:after="200"/>
+        <w:jc w:val="both"/>
+        <w:rPr>
+          <w:rFonts w:ascii="Century Gothic" w:hAnsi="Century Gothic"/>
+          <w:sz w:val="24"/>
+          <w:szCs w:val="24"/>
+        </w:rPr>
+      </w:pPr>
+      <w:r>
+        <w:rPr>
+          <w:rFonts w:ascii="Century Gothic" w:hAnsi="Century Gothic"/>
+          <w:b/>
+          <w:bCs/>
+          <w:sz w:val="24"/>
+          <w:szCs w:val="24"/>
+        </w:rPr>
+        <w:t>Tipo de Campo:</w:t>
+      </w:r>
+      <w:r>
+        <w:rPr>
+          <w:rFonts w:ascii="Century Gothic" w:hAnsi="Century Gothic"/>
+          <w:sz w:val="24"/>
+          <w:szCs w:val="24"/>
+        </w:rPr>
+        <w:t xml:space="preserve"> Janela de opções (</w:t>
+      </w:r>
+      <w:proofErr w:type="spellStart"/>
+      <w:r>
+        <w:rPr>
+          <w:rFonts w:ascii="Century Gothic" w:hAnsi="Century Gothic"/>
+          <w:sz w:val="24"/>
+          <w:szCs w:val="24"/>
+        </w:rPr>
+        <w:t>Dropdown</w:t>
+      </w:r>
+      <w:proofErr w:type="spellEnd"/>
+      <w:r>
+        <w:rPr>
+          <w:rFonts w:ascii="Century Gothic" w:hAnsi="Century Gothic"/>
+          <w:sz w:val="24"/>
+          <w:szCs w:val="24"/>
+        </w:rPr>
+        <w:t>/Caixa de seleção).</w:t>
+      </w:r>
+    </w:p>
+    <w:p>
+      <w:pPr>
+        <w:numPr>
+          <w:ilvl w:val="1"/>
+          <w:numId w:val="3"/>
+        </w:numPr>
+        <w:spacing w:after="200"/>
+        <w:jc w:val="both"/>
+        <w:rPr>
+          <w:rFonts w:ascii="Century Gothic" w:hAnsi="Century Gothic"/>
+          <w:sz w:val="24"/>
+          <w:szCs w:val="24"/>
+        </w:rPr>
+      </w:pPr>
+      <w:r>
+        <w:rPr>
+          <w:rFonts w:ascii="Century Gothic" w:hAnsi="Century Gothic"/>
+          <w:b/>
+          <w:bCs/>
+          <w:sz w:val="24"/>
+          <w:szCs w:val="24"/>
+        </w:rPr>
+        <w:t>Opções:</w:t>
+      </w:r>
+      <w:r>
+        <w:rPr>
+          <w:rFonts w:ascii="Century Gothic" w:hAnsi="Century Gothic"/>
+          <w:sz w:val="24"/>
+          <w:szCs w:val="24"/>
+        </w:rPr>
+        <w:t xml:space="preserve"> </w:t>
       </w:r>
     </w:p>
     <w:p>
@@ -1398,124 +1532,7 @@
           <w:sz w:val="24"/>
           <w:szCs w:val="24"/>
         </w:rPr>
-        <w:t>Idoso (60+ anos)</w:t>
-      </w:r>
-    </w:p>
-    <w:p>
-      <w:pPr>
-        <w:numPr>
-          <w:ilvl w:val="0"/>
-          <w:numId w:val="3"/>
-        </w:numPr>
-        <w:spacing w:after="200"/>
-        <w:jc w:val="both"/>
-        <w:rPr>
-          <w:rFonts w:ascii="Century Gothic" w:hAnsi="Century Gothic"/>
-          <w:sz w:val="24"/>
-          <w:szCs w:val="24"/>
-        </w:rPr>
-      </w:pPr>
-      <w:r>
-        <w:rPr>
-          <w:rFonts w:ascii="Century Gothic" w:hAnsi="Century Gothic"/>
-          <w:b/>
-          <w:bCs/>
-          <w:sz w:val="24"/>
-          <w:szCs w:val="24"/>
-        </w:rPr>
-        <w:t>Status do Paciente:</w:t>
-      </w:r>
-      <w:r>
-        <w:rPr>
-          <w:rFonts w:ascii="Century Gothic" w:hAnsi="Century Gothic"/>
-          <w:sz w:val="24"/>
-          <w:szCs w:val="24"/>
-        </w:rPr>
-        <w:t xml:space="preserve"> </w:t>
-      </w:r>
-    </w:p>
-    <w:p>
-      <w:pPr>
-        <w:numPr>
-          <w:ilvl w:val="1"/>
-          <w:numId w:val="3"/>
-        </w:numPr>
-        <w:spacing w:after="200"/>
-        <w:jc w:val="both"/>
-        <w:rPr>
-          <w:rFonts w:ascii="Century Gothic" w:hAnsi="Century Gothic"/>
-          <w:sz w:val="24"/>
-          <w:szCs w:val="24"/>
-        </w:rPr>
-      </w:pPr>
-      <w:r>
-        <w:rPr>
-          <w:rFonts w:ascii="Century Gothic" w:hAnsi="Century Gothic"/>
-          <w:b/>
-          <w:bCs/>
-          <w:sz w:val="24"/>
-          <w:szCs w:val="24"/>
-        </w:rPr>
-        <w:t>Tipo de Campo:</w:t>
-      </w:r>
-      <w:r>
-        <w:rPr>
-          <w:rFonts w:ascii="Century Gothic" w:hAnsi="Century Gothic"/>
-          <w:sz w:val="24"/>
-          <w:szCs w:val="24"/>
-        </w:rPr>
-        <w:t xml:space="preserve"> Janela de opções (</w:t>
-      </w:r>
-      <w:proofErr w:type="spellStart"/>
-      <w:r>
-        <w:rPr>
-          <w:rFonts w:ascii="Century Gothic" w:hAnsi="Century Gothic"/>
-          <w:sz w:val="24"/>
-          <w:szCs w:val="24"/>
-        </w:rPr>
-        <w:t>Dropdown</w:t>
-      </w:r>
-      <w:proofErr w:type="spellEnd"/>
-      <w:r>
-        <w:rPr>
-          <w:rFonts w:ascii="Century Gothic" w:hAnsi="Century Gothic"/>
-          <w:sz w:val="24"/>
-          <w:szCs w:val="24"/>
-        </w:rPr>
-        <w:t>/Caixa de seleção).</w:t>
-      </w:r>
-    </w:p>
-    <w:p>
-      <w:pPr>
-        <w:numPr>
-          <w:ilvl w:val="1"/>
-          <w:numId w:val="3"/>
-        </w:numPr>
-        <w:spacing w:after="200"/>
-        <w:jc w:val="both"/>
-        <w:rPr>
-          <w:rFonts w:ascii="Century Gothic" w:hAnsi="Century Gothic"/>
-          <w:sz w:val="24"/>
-          <w:szCs w:val="24"/>
-        </w:rPr>
-      </w:pPr>
-      <w:r>
-        <w:rPr>
-          <w:rFonts w:ascii="Century Gothic" w:hAnsi="Century Gothic"/>
-          <w:b/>
-          <w:bCs/>
-          <w:sz w:val="24"/>
-          <w:szCs w:val="24"/>
-        </w:rPr>
-        <w:t>Opções:</w:t>
-      </w:r>
-      <w:r>
-        <w:rPr>
-          <w:rFonts w:ascii="Century Gothic" w:hAnsi="Century Gothic"/>
-          <w:sz w:val="24"/>
-          <w:szCs w:val="24"/>
-        </w:rPr>
-        <w:t xml:space="preserve"> </w:t>
+        <w:t>Ativo</w:t>
       </w:r>
     </w:p>
     <w:p>
@@ -1538,7 +1555,7 @@
           <w:sz w:val="24"/>
           <w:szCs w:val="24"/>
         </w:rPr>
-        <w:t>Ativo</w:t>
+        <w:t>Inativo</w:t>
       </w:r>
     </w:p>
     <w:p>
@@ -1561,7 +1578,7 @@
           <w:sz w:val="24"/>
           <w:szCs w:val="24"/>
         </w:rPr>
-        <w:t>Inativo</w:t>
+        <w:t>Alta</w:t>
       </w:r>
     </w:p>
     <w:p>
@@ -1584,29 +1601,6 @@
           <w:sz w:val="24"/>
           <w:szCs w:val="24"/>
         </w:rPr>
-        <w:t>Alta</w:t>
-      </w:r>
-    </w:p>
-    <w:p>
-      <w:pPr>
-        <w:numPr>
-          <w:ilvl w:val="2"/>
-          <w:numId w:val="3"/>
-        </w:numPr>
-        <w:spacing w:after="200"/>
-        <w:jc w:val="both"/>
-        <w:rPr>
-          <w:rFonts w:ascii="Century Gothic" w:hAnsi="Century Gothic"/>
-          <w:sz w:val="24"/>
-          <w:szCs w:val="24"/>
-        </w:rPr>
-      </w:pPr>
-      <w:r>
-        <w:rPr>
-          <w:rFonts w:ascii="Century Gothic" w:hAnsi="Century Gothic"/>
-          <w:sz w:val="24"/>
-          <w:szCs w:val="24"/>
-        </w:rPr>
         <w:t>Em Espera</w:t>
       </w:r>
     </w:p>
@@ -1630,7 +1624,6 @@
           <w:sz w:val="24"/>
           <w:szCs w:val="24"/>
         </w:rPr>
-        <w:lastRenderedPageBreak/>
         <w:t>1.3 Espaço para Informações Adicionais</w:t>
       </w:r>
     </w:p>
@@ -1656,6 +1649,7 @@
           <w:sz w:val="24"/>
           <w:szCs w:val="24"/>
         </w:rPr>
+        <w:lastRenderedPageBreak/>
         <w:t>Campo "Observações Gerais":</w:t>
       </w:r>
       <w:r>
@@ -2444,7 +2438,6 @@
           <w:sz w:val="24"/>
           <w:szCs w:val="24"/>
         </w:rPr>
-        <w:lastRenderedPageBreak/>
         <w:t>2.2 Vinculação e Filtragem</w:t>
       </w:r>
     </w:p>
@@ -2470,6 +2463,7 @@
           <w:sz w:val="24"/>
           <w:szCs w:val="24"/>
         </w:rPr>
+        <w:lastRenderedPageBreak/>
         <w:t>Vinculação:</w:t>
       </w:r>
       <w:r>
@@ -3147,38 +3141,38 @@
           <w:sz w:val="24"/>
           <w:szCs w:val="24"/>
         </w:rPr>
+        <w:t>Anexar Laudo:</w:t>
+      </w:r>
+      <w:r>
+        <w:rPr>
+          <w:rFonts w:ascii="Century Gothic" w:hAnsi="Century Gothic"/>
+          <w:sz w:val="24"/>
+          <w:szCs w:val="24"/>
+        </w:rPr>
+        <w:t xml:space="preserve"> Opção para anexar o laudo final em PDF.</w:t>
+      </w:r>
+    </w:p>
+    <w:p>
+      <w:pPr>
+        <w:spacing w:after="200"/>
+        <w:jc w:val="both"/>
+        <w:rPr>
+          <w:rFonts w:ascii="Century Gothic" w:hAnsi="Century Gothic"/>
+          <w:b/>
+          <w:bCs/>
+          <w:sz w:val="24"/>
+          <w:szCs w:val="24"/>
+        </w:rPr>
+      </w:pPr>
+      <w:r>
+        <w:rPr>
+          <w:rFonts w:ascii="Century Gothic" w:hAnsi="Century Gothic"/>
+          <w:b/>
+          <w:bCs/>
+          <w:sz w:val="24"/>
+          <w:szCs w:val="24"/>
+        </w:rPr>
         <w:lastRenderedPageBreak/>
-        <w:t>Anexar Laudo:</w:t>
-      </w:r>
-      <w:r>
-        <w:rPr>
-          <w:rFonts w:ascii="Century Gothic" w:hAnsi="Century Gothic"/>
-          <w:sz w:val="24"/>
-          <w:szCs w:val="24"/>
-        </w:rPr>
-        <w:t xml:space="preserve"> Opção para anexar o laudo final em PDF.</w:t>
-      </w:r>
-    </w:p>
-    <w:p>
-      <w:pPr>
-        <w:spacing w:after="200"/>
-        <w:jc w:val="both"/>
-        <w:rPr>
-          <w:rFonts w:ascii="Century Gothic" w:hAnsi="Century Gothic"/>
-          <w:b/>
-          <w:bCs/>
-          <w:sz w:val="24"/>
-          <w:szCs w:val="24"/>
-        </w:rPr>
-      </w:pPr>
-      <w:r>
-        <w:rPr>
-          <w:rFonts w:ascii="Century Gothic" w:hAnsi="Century Gothic"/>
-          <w:b/>
-          <w:bCs/>
-          <w:sz w:val="24"/>
-          <w:szCs w:val="24"/>
-        </w:rPr>
         <w:t>3.3 Reabilitação Neuropsicológica</w:t>
       </w:r>
     </w:p>
@@ -4078,7 +4072,6 @@
           <w:sz w:val="24"/>
           <w:szCs w:val="24"/>
         </w:rPr>
-        <w:lastRenderedPageBreak/>
         <w:t>Opções:</w:t>
       </w:r>
       <w:r>
@@ -4110,6 +4103,7 @@
           <w:sz w:val="24"/>
           <w:szCs w:val="24"/>
         </w:rPr>
+        <w:lastRenderedPageBreak/>
         <w:t>Objetivo Alcançado</w:t>
       </w:r>
     </w:p>
@@ -4911,56 +4905,56 @@
           <w:sz w:val="24"/>
           <w:szCs w:val="24"/>
         </w:rPr>
+        <w:t>Vinculação Financeira:</w:t>
+      </w:r>
+      <w:r>
+        <w:rPr>
+          <w:rFonts w:ascii="Century Gothic" w:hAnsi="Century Gothic"/>
+          <w:sz w:val="24"/>
+          <w:szCs w:val="24"/>
+        </w:rPr>
+        <w:t xml:space="preserve"> Cada registro de venda aqui automaticamente geraria uma entrada correspondente no </w:t>
+      </w:r>
+      <w:r>
+        <w:rPr>
+          <w:rFonts w:ascii="Century Gothic" w:hAnsi="Century Gothic"/>
+          <w:b/>
+          <w:bCs/>
+          <w:sz w:val="24"/>
+          <w:szCs w:val="24"/>
+        </w:rPr>
+        <w:t>Registro Financeiro</w:t>
+      </w:r>
+      <w:r>
+        <w:rPr>
+          <w:rFonts w:ascii="Century Gothic" w:hAnsi="Century Gothic"/>
+          <w:sz w:val="24"/>
+          <w:szCs w:val="24"/>
+        </w:rPr>
+        <w:t>, vinculada ao paciente e categorizada como "Venda de Produto (Vinculada ao Paciente)".</w:t>
+      </w:r>
+    </w:p>
+    <w:p>
+      <w:pPr>
+        <w:spacing w:after="200"/>
+        <w:jc w:val="both"/>
+        <w:rPr>
+          <w:rFonts w:ascii="Century Gothic" w:hAnsi="Century Gothic"/>
+          <w:b/>
+          <w:bCs/>
+          <w:sz w:val="24"/>
+          <w:szCs w:val="24"/>
+        </w:rPr>
+      </w:pPr>
+      <w:r>
+        <w:rPr>
+          <w:rFonts w:ascii="Century Gothic" w:hAnsi="Century Gothic"/>
+          <w:b/>
+          <w:bCs/>
+          <w:sz w:val="24"/>
+          <w:szCs w:val="24"/>
+        </w:rPr>
         <w:lastRenderedPageBreak/>
-        <w:t>Vinculação Financeira:</w:t>
-      </w:r>
-      <w:r>
-        <w:rPr>
-          <w:rFonts w:ascii="Century Gothic" w:hAnsi="Century Gothic"/>
-          <w:sz w:val="24"/>
-          <w:szCs w:val="24"/>
-        </w:rPr>
-        <w:t xml:space="preserve"> Cada registro de venda aqui automaticamente geraria uma entrada correspondente no </w:t>
-      </w:r>
-      <w:r>
-        <w:rPr>
-          <w:rFonts w:ascii="Century Gothic" w:hAnsi="Century Gothic"/>
-          <w:b/>
-          <w:bCs/>
-          <w:sz w:val="24"/>
-          <w:szCs w:val="24"/>
-        </w:rPr>
-        <w:t>Registro Financeiro</w:t>
-      </w:r>
-      <w:r>
-        <w:rPr>
-          <w:rFonts w:ascii="Century Gothic" w:hAnsi="Century Gothic"/>
-          <w:sz w:val="24"/>
-          <w:szCs w:val="24"/>
-        </w:rPr>
-        <w:t>, vinculada ao paciente e categorizada como "Venda de Produto (Vinculada ao Paciente)".</w:t>
-      </w:r>
-    </w:p>
-    <w:p>
-      <w:pPr>
-        <w:spacing w:after="200"/>
-        <w:jc w:val="both"/>
-        <w:rPr>
-          <w:rFonts w:ascii="Century Gothic" w:hAnsi="Century Gothic"/>
-          <w:b/>
-          <w:bCs/>
-          <w:sz w:val="24"/>
-          <w:szCs w:val="24"/>
-        </w:rPr>
-      </w:pPr>
-      <w:r>
-        <w:rPr>
-          <w:rFonts w:ascii="Century Gothic" w:hAnsi="Century Gothic"/>
-          <w:b/>
-          <w:bCs/>
-          <w:sz w:val="24"/>
-          <w:szCs w:val="24"/>
-        </w:rPr>
         <w:t>4.2 Vendas de Material do Consultório (Geral)</w:t>
       </w:r>
     </w:p>
@@ -5836,7 +5830,6 @@
           <w:sz w:val="24"/>
           <w:szCs w:val="24"/>
         </w:rPr>
-        <w:lastRenderedPageBreak/>
         <w:t xml:space="preserve">NÃO tem acesso às abas de </w:t>
       </w:r>
       <w:r>
@@ -5878,6 +5871,7 @@
           <w:sz w:val="24"/>
           <w:szCs w:val="24"/>
         </w:rPr>
+        <w:lastRenderedPageBreak/>
         <w:t>NÃO pode inserir ou modificar valores nem finalizar o registro de pagamento nas áreas de Vendas.</w:t>
       </w:r>
     </w:p>
@@ -6481,7 +6475,6 @@
           <w:sz w:val="24"/>
           <w:szCs w:val="24"/>
         </w:rPr>
-        <w:lastRenderedPageBreak/>
         <w:t>Gestão de Usuários (adicionar/remover psicólogas, secretárias, outros administradores, gerenciar senhas e permissões).</w:t>
       </w:r>
     </w:p>
@@ -6505,6 +6498,7 @@
           <w:sz w:val="24"/>
           <w:szCs w:val="24"/>
         </w:rPr>
+        <w:lastRenderedPageBreak/>
         <w:t>Relatórios Gerenciais abrangentes (financeiros, de pacientes, de utilização de serviços e vendas de produtos).</w:t>
       </w:r>
     </w:p>

</xml_diff>